<commit_message>
Templates: US spelling throughout
</commit_message>
<xml_diff>
--- a/brand/bolt-creative-sow.docx
+++ b/brand/bolt-creative-sow.docx
@@ -497,7 +497,7 @@
         <w:pStyle w:val="Body"/>
       </w:pPr>
       <w:r>
-        <w:t xml:space="preserve">Two or three sentences on the problem in the client’s own words. If they would not recognise it, the rest of this document is guesswork.</w:t>
+        <w:t xml:space="preserve">Two or three sentences on the problem in the client’s own words. If they would not recognize it, the rest of this document is guesswork.</w:t>
       </w:r>
     </w:p>
     <w:p>
@@ -1386,7 +1386,7 @@
         <w:pStyle w:val="Body"/>
       </w:pPr>
       <w:r>
-        <w:t xml:space="preserve">Signing below authorises the work described above. Everything else — confidentiality, insurance, liability, indemnity, termination — is governed by the agreement named at the top of this page.</w:t>
+        <w:t xml:space="preserve">Signing below authorizes the work described above. Everything else — confidentiality, insurance, liability, indemnity, termination — is governed by the agreement named at the top of this page.</w:t>
       </w:r>
     </w:p>
     <w:tbl>

</xml_diff>